<commit_message>
Week 03: Week 2 question numbers on the slides and demos, answer-sheet fixes
- Lecture deck: titles now use the Week 2 sheet's numbering (diet problem Q6a/6b/6c,
  manufacturing Q5c adapted); slide 8 grammar; "Units of food i" for x_i on slides 9, 11, 13.
- Demos 2-4: headings and lecture references match the new slide titles (text and one code
  comment only); renamed 5a/5b/5c -> 6a/6b/6c.
- Answers .docx: index i shown under the second sum in Q2a; LP optimum line added to Q1.
- MATLAB Q1a/Q1b (previous tutorial version) moved into "Old Q1 (previous tutorial version)",
  as for the Python copies.

Co-Authored-By: Claude Opus 5.5 <noreply@anthropic.com>
Claude-Session: https://claude.ai/code/session_01LbZQcZeMRKpatByEkeYsyp

[skip ci]
</commit_message>
<xml_diff>
--- a/content/Lectures/Semester 1/Week 03 - Linear Programming 2/4 Tutorial Answers/Week 3 - Linear Programming 2 - Tutorial - Answers.docx
+++ b/content/Lectures/Semester 1/Week 03 - Linear Programming 2/4 Tutorial Answers/Week 3 - Linear Programming 2 - Tutorial - Answers.docx
@@ -179,6 +179,21 @@
           </m:r>
         </m:oMath>
       </m:oMathPara>
+    </w:p>
+    <w:p>
+      <w:pPr>
+        <w:ind w:left="1080"/>
+      </w:pPr>
+      <w:r>
+        <w:rPr>
+          <w:b/>
+          <w:bCs/>
+        </w:rPr>
+        <w:t>LP optimum:</w:t>
+      </w:r>
+      <w:r>
+        <w:t xml:space="preserve"> x = 7.5, y = 10, objective = 270.</w:t>
+      </w:r>
     </w:p>
     <w:p>
       <w:pPr>
@@ -1030,7 +1045,6 @@
               <m:nary>
                 <m:naryPr>
                   <m:chr m:val="∑"/>
-                  <m:subHide m:val="1"/>
                   <m:supHide m:val="1"/>
                   <m:ctrlPr>
                     <w:rPr>
@@ -1039,7 +1053,14 @@
                     </w:rPr>
                   </m:ctrlPr>
                 </m:naryPr>
-                <m:sub/>
+                <m:sub>
+                  <m:r>
+                    <w:rPr>
+                      <w:rFonts w:ascii="Cambria Math" w:hAnsi="Cambria Math"/>
+                    </w:rPr>
+                    <m:t>i</m:t>
+                  </m:r>
+                </m:sub>
                 <m:sup/>
                 <m:e>
                   <m:sSub>

</xml_diff>